<commit_message>
Blog: add the real-model run to both posts; rebuild the Word files; one-command blog build
- 02-inside-openais-watermark: a real-model paragraph under "What transfers from the toy model"
  (Qwen2.5-1.5B-Instruct, results/hf-20261013-074938: signal halves, desync attacks now bite,
  57% / 70% detection after LLM paraphrase / French round trip, retrieval 100%); the paraphrase
  point in "limited by design" now cites the measured row; reproduce_hf.sh in "Run it yourself"
- 01-why-an-invisible-stamp-wont-keep-ai-safe: one plain-English paragraph with the same numbers
- both bylines marked "updated 13 October 2026"; Word files regenerated (pandoc -> LibreOffice,
  validated) by the new blog/build.sh (`make blog`)

Co-Authored-By: Claude Fable 5.1 <noreply@anthropic.com>
Claude-Session: https://claude.ai/code/session_0155RYmv7KvoKSFnR9AwEikW
</commit_message>
<xml_diff>
--- a/blog/01-why-an-invisible-stamp-wont-keep-ai-safe.docx
+++ b/blog/01-why-an-invisible-stamp-wont-keep-ai-safe.docx
@@ -26,7 +26,7 @@
           <w:i/>
           <w:iCs/>
         </w:rPr>
-        <w:t>Yobie Benjamin · 7 October 2026</w:t>
+        <w:t>Yobie Benjamin · 7 October 2026 · updated 13 October 2026</w:t>
       </w:r>
     </w:p>
     <w:p>
@@ -131,6 +131,16 @@
       <w:r>
         <w:rPr/>
         <w:t>Rewrite half the words? Caught about one time in five.</w:t>
+      </w:r>
+    </w:p>
+    <w:p>
+      <w:pPr>
+        <w:pStyle w:val="BodyText"/>
+        <w:rPr/>
+      </w:pPr>
+      <w:r>
+        <w:rPr/>
+        <w:t>That was with a small stand-in model. We then ran the same attacks on a real AI model, the kind that runs on a laptop. The stamp got fainter. Copying still got caught 98 times in 100. But ask another AI to reword the text and the stamp survived only about half the time; translate it to French and back, about two times in three; rewrite half the words and it was caught one time in twenty.</w:t>
       </w:r>
     </w:p>
     <w:p>

</xml_diff>